<commit_message>
Finalize selected КОД.МЭТЧ presentation and jury documents
</commit_message>
<xml_diff>
--- a/documents/КОД.МЭТЧ_Инструкция_для_жюри.docx
+++ b/documents/КОД.МЭТЧ_Инструкция_для_жюри.docx
@@ -65,11 +65,11 @@
       <w:hyperlink r:id="rId11">
         <w:r>
           <w:rPr>
+            <w:rFonts w:ascii="Arial" w:hAnsi="Arial" w:cs="Arial"/>
             <w:color w:val="402FFF"/>
             <w:u w:val="single"/>
-            <w:rFonts w:ascii="Arial" w:hAnsi="Arial"/>
           </w:rPr>
-          <w:t>Открыть сервис</w:t>
+          <w:t xml:space="preserve">Открыть сервис</w:t>
         </w:r>
       </w:hyperlink>
       <w:r>
@@ -84,11 +84,11 @@
       <w:hyperlink r:id="rId12">
         <w:r>
           <w:rPr>
+            <w:rFonts w:ascii="Arial" w:hAnsi="Arial" w:cs="Arial"/>
             <w:color w:val="402FFF"/>
             <w:u w:val="single"/>
-            <w:rFonts w:ascii="Arial" w:hAnsi="Arial"/>
           </w:rPr>
-          <w:t>Бот MAX</w:t>
+          <w:t xml:space="preserve">Бот MAX</w:t>
         </w:r>
       </w:hyperlink>
       <w:r>
@@ -103,11 +103,11 @@
       <w:hyperlink r:id="rId13">
         <w:r>
           <w:rPr>
+            <w:rFonts w:ascii="Arial" w:hAnsi="Arial" w:cs="Arial"/>
             <w:color w:val="402FFF"/>
             <w:u w:val="single"/>
-            <w:rFonts w:ascii="Arial" w:hAnsi="Arial"/>
           </w:rPr>
-          <w:t>Поддержка</w:t>
+          <w:t xml:space="preserve">Поддержка</w:t>
         </w:r>
       </w:hyperlink>
       <w:r>
@@ -142,10 +142,13 @@
           <w:color w:val="402FFF"/>
           <w:sz w:val="36"/>
         </w:rPr>
-        <w:t>1. Подготовка</w:t>
+        <w:t>1. Доступ и подготовка</w:t>
       </w:r>
     </w:p>
     <w:p>
+      <w:pPr>
+        <w:ind w:left="340" w:hanging="340"/>
+      </w:pPr>
       <w:r>
         <w:rPr>
           <w:rFonts w:ascii="Arial" w:hAnsi="Arial"/>
@@ -153,7 +156,163 @@
           <w:color w:val="222436"/>
           <w:sz w:val="20"/>
         </w:rPr>
-        <w:t xml:space="preserve">Понадобятся кандидат и работодатель. Владелец передает доступы приватно либо проверяющий регистрирует свои адреса с подтверждением email. Откройте роли в разных браузерах или профилях браузера: обычные вкладки одного профиля разделяют cookie. Перед действием проверьте подпись роли в меню. Узкое меню открывается кнопкой сверху слева; </w:t>
+        <w:t xml:space="preserve">1. Откройте сервис </w:t>
+      </w:r>
+      <w:hyperlink r:id="rId11">
+        <w:r>
+          <w:rPr>
+            <w:rFonts w:ascii="Arial" w:hAnsi="Arial" w:cs="Arial"/>
+            <w:color w:val="402FFF"/>
+            <w:u w:val="single"/>
+          </w:rPr>
+          <w:t xml:space="preserve">fsp.digital-projects.tech</w:t>
+        </w:r>
+      </w:hyperlink>
+      <w:r>
+        <w:rPr>
+          <w:rFonts w:ascii="Arial" w:hAnsi="Arial"/>
+          <w:b w:val="0"/>
+          <w:color w:val="222436"/>
+          <w:sz w:val="20"/>
+        </w:rPr>
+        <w:t xml:space="preserve">. Для основного сценария нужны две роли: </w:t>
+      </w:r>
+      <w:r>
+        <w:rPr>
+          <w:rFonts w:ascii="Arial" w:hAnsi="Arial"/>
+          <w:b/>
+          <w:color w:val="222436"/>
+          <w:sz w:val="20"/>
+        </w:rPr>
+        <w:t>«Кандидат»</w:t>
+      </w:r>
+      <w:r>
+        <w:rPr>
+          <w:rFonts w:ascii="Arial" w:hAnsi="Arial"/>
+          <w:b w:val="0"/>
+          <w:color w:val="222436"/>
+          <w:sz w:val="20"/>
+        </w:rPr>
+        <w:t xml:space="preserve"> и </w:t>
+      </w:r>
+      <w:r>
+        <w:rPr>
+          <w:rFonts w:ascii="Arial" w:hAnsi="Arial"/>
+          <w:b/>
+          <w:color w:val="222436"/>
+          <w:sz w:val="20"/>
+        </w:rPr>
+        <w:t>«Работодатель»</w:t>
+      </w:r>
+      <w:r>
+        <w:rPr>
+          <w:rFonts w:ascii="Arial" w:hAnsi="Arial"/>
+          <w:b w:val="0"/>
+          <w:color w:val="222436"/>
+          <w:sz w:val="20"/>
+        </w:rPr>
+        <w:t>.</w:t>
+      </w:r>
+    </w:p>
+    <w:p>
+      <w:pPr>
+        <w:ind w:left="340" w:hanging="340"/>
+      </w:pPr>
+      <w:r>
+        <w:rPr>
+          <w:rFonts w:ascii="Arial" w:hAnsi="Arial"/>
+          <w:b w:val="0"/>
+          <w:color w:val="222436"/>
+          <w:sz w:val="20"/>
+        </w:rPr>
+        <w:t xml:space="preserve">2. Зарегистрируйте кандидата и работодателя на двух своих адресах: </w:t>
+      </w:r>
+      <w:r>
+        <w:rPr>
+          <w:rFonts w:ascii="Arial" w:hAnsi="Arial"/>
+          <w:b/>
+          <w:color w:val="222436"/>
+          <w:sz w:val="20"/>
+        </w:rPr>
+        <w:t>«Создать профиль»</w:t>
+      </w:r>
+      <w:r>
+        <w:rPr>
+          <w:rFonts w:ascii="Arial" w:hAnsi="Arial"/>
+          <w:b w:val="0"/>
+          <w:color w:val="222436"/>
+          <w:sz w:val="20"/>
+        </w:rPr>
+        <w:t xml:space="preserve"> → роль → email и пароль не короче 12 символов → согласие → </w:t>
+      </w:r>
+      <w:r>
+        <w:rPr>
+          <w:rFonts w:ascii="Arial" w:hAnsi="Arial"/>
+          <w:b/>
+          <w:color w:val="222436"/>
+          <w:sz w:val="20"/>
+        </w:rPr>
+        <w:t>«Создать учетную запись»</w:t>
+      </w:r>
+      <w:r>
+        <w:rPr>
+          <w:rFonts w:ascii="Arial" w:hAnsi="Arial"/>
+          <w:b w:val="0"/>
+          <w:color w:val="222436"/>
+          <w:sz w:val="20"/>
+        </w:rPr>
+        <w:t xml:space="preserve"> → письмо КОД.МЭТЧ → </w:t>
+      </w:r>
+      <w:r>
+        <w:rPr>
+          <w:rFonts w:ascii="Arial" w:hAnsi="Arial"/>
+          <w:b/>
+          <w:color w:val="222436"/>
+          <w:sz w:val="20"/>
+        </w:rPr>
+        <w:t>«Подтвердить email»</w:t>
+      </w:r>
+      <w:r>
+        <w:rPr>
+          <w:rFonts w:ascii="Arial" w:hAnsi="Arial"/>
+          <w:b w:val="0"/>
+          <w:color w:val="222436"/>
+          <w:sz w:val="20"/>
+        </w:rPr>
+        <w:t xml:space="preserve"> → вход. Если письмо не пришло (проверьте и «Спам»), напишите на </w:t>
+      </w:r>
+      <w:hyperlink r:id="rId13">
+        <w:r>
+          <w:rPr>
+            <w:rFonts w:ascii="Arial" w:hAnsi="Arial" w:cs="Arial"/>
+            <w:color w:val="402FFF"/>
+            <w:u w:val="single"/>
+          </w:rPr>
+          <w:t xml:space="preserve">codematch@mail.ru</w:t>
+        </w:r>
+      </w:hyperlink>
+      <w:r>
+        <w:rPr>
+          <w:rFonts w:ascii="Arial" w:hAnsi="Arial"/>
+          <w:b w:val="0"/>
+          <w:color w:val="222436"/>
+          <w:sz w:val="20"/>
+        </w:rPr>
+        <w:t xml:space="preserve"> – команда поможет с доступом.</w:t>
+      </w:r>
+    </w:p>
+    <w:p>
+      <w:pPr>
+        <w:ind w:left="340" w:hanging="340"/>
+      </w:pPr>
+      <w:r>
+        <w:rPr>
+          <w:rFonts w:ascii="Arial" w:hAnsi="Arial"/>
+          <w:b w:val="0"/>
+          <w:color w:val="222436"/>
+          <w:sz w:val="20"/>
+        </w:rPr>
+        <w:t xml:space="preserve">3. Откройте роли в разных браузерах или профилях браузера: обычные вкладки одного профиля разделяют cookie. Перед действием проверьте подпись роли в меню. Узкое меню открывается кнопкой сверху слева; </w:t>
       </w:r>
       <w:r>
         <w:rPr>
@@ -175,6 +334,9 @@
       </w:r>
     </w:p>
     <w:p>
+      <w:pPr>
+        <w:ind w:left="340" w:hanging="340"/>
+      </w:pPr>
       <w:r>
         <w:rPr>
           <w:rFonts w:ascii="Arial" w:hAnsi="Arial"/>
@@ -182,7 +344,51 @@
           <w:color w:val="222436"/>
           <w:sz w:val="20"/>
         </w:rPr>
-        <w:t>Заранее подтвержденные аккаунты подходят для бизнес-сценария, но не доказывают получение нового письма. Для нового первичного теста используйте профиль без попытки выбранной категории: повтор одной категории ограничен 90 днями, историю не сбрасывают. Результаты технической проверки не являются оценкой способностей проверявшего человека.</w:t>
+        <w:t>4. Для первичного теста нужен кандидат без попытки выбранной категории: повтор одной категории ограничен 90 днями, историю не сбрасывают.</w:t>
+      </w:r>
+    </w:p>
+    <w:p>
+      <w:pPr>
+        <w:ind w:left="340" w:hanging="340"/>
+      </w:pPr>
+      <w:r>
+        <w:rPr>
+          <w:rFonts w:ascii="Arial" w:hAnsi="Arial"/>
+          <w:b w:val="0"/>
+          <w:color w:val="222436"/>
+          <w:sz w:val="20"/>
+        </w:rPr>
+        <w:t xml:space="preserve">5. При сбое напишите в поддержку </w:t>
+      </w:r>
+      <w:hyperlink r:id="rId13">
+        <w:r>
+          <w:rPr>
+            <w:rFonts w:ascii="Arial" w:hAnsi="Arial" w:cs="Arial"/>
+            <w:color w:val="402FFF"/>
+            <w:u w:val="single"/>
+          </w:rPr>
+          <w:t xml:space="preserve">codematch@mail.ru</w:t>
+        </w:r>
+      </w:hyperlink>
+      <w:r>
+        <w:rPr>
+          <w:rFonts w:ascii="Arial" w:hAnsi="Arial"/>
+          <w:b w:val="0"/>
+          <w:color w:val="222436"/>
+          <w:sz w:val="20"/>
+        </w:rPr>
+        <w:t>: роль, действие, время, ожидаемое и фактическое поведение. Не передавайте пароли, токены из писем и одноразовые коды MAX.</w:t>
+      </w:r>
+    </w:p>
+    <w:p>
+      <w:r>
+        <w:rPr>
+          <w:rFonts w:ascii="Arial" w:hAnsi="Arial"/>
+          <w:b w:val="0"/>
+          <w:color w:val="222436"/>
+          <w:sz w:val="20"/>
+        </w:rPr>
+        <w:t>Результаты технической проверки не являются оценкой способностей проверявшего человека.</w:t>
       </w:r>
     </w:p>
     <w:p>
@@ -868,7 +1074,7 @@
           <w:rFonts w:ascii="Courier New" w:hAnsi="Courier New"/>
           <w:b w:val="0"/>
           <w:color w:val="222436"/>
-          <w:sz w:val="16"/>
+          <w:sz w:val="17"/>
         </w:rPr>
         <w:t>AI-разбор</w:t>
       </w:r>
@@ -886,7 +1092,7 @@
           <w:rFonts w:ascii="Courier New" w:hAnsi="Courier New"/>
           <w:b w:val="0"/>
           <w:color w:val="222436"/>
-          <w:sz w:val="16"/>
+          <w:sz w:val="17"/>
         </w:rPr>
         <w:t>AI-пояснение по фактам</w:t>
       </w:r>
@@ -953,7 +1159,7 @@
           <w:rFonts w:ascii="Courier New" w:hAnsi="Courier New"/>
           <w:b w:val="0"/>
           <w:color w:val="222436"/>
-          <w:sz w:val="16"/>
+          <w:sz w:val="17"/>
         </w:rPr>
         <w:t>/help</w:t>
       </w:r>
@@ -971,7 +1177,7 @@
           <w:rFonts w:ascii="Courier New" w:hAnsi="Courier New"/>
           <w:b w:val="0"/>
           <w:color w:val="222436"/>
-          <w:sz w:val="16"/>
+          <w:sz w:val="17"/>
         </w:rPr>
         <w:t>/status</w:t>
       </w:r>
@@ -989,7 +1195,7 @@
           <w:rFonts w:ascii="Courier New" w:hAnsi="Courier New"/>
           <w:b w:val="0"/>
           <w:color w:val="222436"/>
-          <w:sz w:val="16"/>
+          <w:sz w:val="17"/>
         </w:rPr>
         <w:t>/unlink</w:t>
       </w:r>
@@ -1037,7 +1243,7 @@
         <w:tc>
           <w:tcPr>
             <w:tcW w:type="dxa" w:w="3175"/>
-            <w:shd w:fill="402FFF"/>
+            <w:shd w:val="clear" w:color="auto" w:fill="402FFF"/>
           </w:tcPr>
           <w:p>
             <w:pPr>
@@ -1058,7 +1264,7 @@
         <w:tc>
           <w:tcPr>
             <w:tcW w:type="dxa" w:w="3231"/>
-            <w:shd w:fill="402FFF"/>
+            <w:shd w:val="clear" w:color="auto" w:fill="402FFF"/>
           </w:tcPr>
           <w:p>
             <w:pPr>
@@ -1079,7 +1285,7 @@
         <w:tc>
           <w:tcPr>
             <w:tcW w:type="dxa" w:w="3231"/>
-            <w:shd w:fill="402FFF"/>
+            <w:shd w:val="clear" w:color="auto" w:fill="402FFF"/>
           </w:tcPr>
           <w:p>
             <w:pPr>
@@ -1138,7 +1344,7 @@
                 <w:color w:val="222436"/>
                 <w:sz w:val="16"/>
               </w:rPr>
-              <w:t>Текстовый PDF ≤5 MiB → предпросмотр → перенос → ручная проверка → сохранение</w:t>
+              <w:t>Текстовый PDF ≤ 5 MiB, до 30 страниц → предпросмотр → перенос → ручная проверка → сохранение</w:t>
             </w:r>
           </w:p>
         </w:tc>
@@ -1170,7 +1376,7 @@
         <w:tc>
           <w:tcPr>
             <w:tcW w:type="dxa" w:w="3175"/>
-            <w:shd w:fill="EFF1F9"/>
+            <w:shd w:val="clear" w:color="auto" w:fill="EFF1F9"/>
           </w:tcPr>
           <w:p>
             <w:pPr>
@@ -1191,7 +1397,7 @@
         <w:tc>
           <w:tcPr>
             <w:tcW w:type="dxa" w:w="3231"/>
-            <w:shd w:fill="EFF1F9"/>
+            <w:shd w:val="clear" w:color="auto" w:fill="EFF1F9"/>
           </w:tcPr>
           <w:p>
             <w:pPr>
@@ -1212,7 +1418,7 @@
         <w:tc>
           <w:tcPr>
             <w:tcW w:type="dxa" w:w="3231"/>
-            <w:shd w:fill="EFF1F9"/>
+            <w:shd w:val="clear" w:color="auto" w:fill="EFF1F9"/>
           </w:tcPr>
           <w:p>
             <w:pPr>
@@ -1303,7 +1509,7 @@
         <w:tc>
           <w:tcPr>
             <w:tcW w:type="dxa" w:w="3175"/>
-            <w:shd w:fill="EFF1F9"/>
+            <w:shd w:val="clear" w:color="auto" w:fill="EFF1F9"/>
           </w:tcPr>
           <w:p>
             <w:pPr>
@@ -1324,7 +1530,7 @@
         <w:tc>
           <w:tcPr>
             <w:tcW w:type="dxa" w:w="3231"/>
-            <w:shd w:fill="EFF1F9"/>
+            <w:shd w:val="clear" w:color="auto" w:fill="EFF1F9"/>
           </w:tcPr>
           <w:p>
             <w:pPr>
@@ -1345,7 +1551,7 @@
         <w:tc>
           <w:tcPr>
             <w:tcW w:type="dxa" w:w="3231"/>
-            <w:shd w:fill="EFF1F9"/>
+            <w:shd w:val="clear" w:color="auto" w:fill="EFF1F9"/>
           </w:tcPr>
           <w:p>
             <w:pPr>
@@ -1436,7 +1642,7 @@
         <w:tc>
           <w:tcPr>
             <w:tcW w:type="dxa" w:w="3175"/>
-            <w:shd w:fill="EFF1F9"/>
+            <w:shd w:val="clear" w:color="auto" w:fill="EFF1F9"/>
           </w:tcPr>
           <w:p>
             <w:pPr>
@@ -1457,7 +1663,7 @@
         <w:tc>
           <w:tcPr>
             <w:tcW w:type="dxa" w:w="3231"/>
-            <w:shd w:fill="EFF1F9"/>
+            <w:shd w:val="clear" w:color="auto" w:fill="EFF1F9"/>
           </w:tcPr>
           <w:p>
             <w:pPr>
@@ -1478,7 +1684,7 @@
         <w:tc>
           <w:tcPr>
             <w:tcW w:type="dxa" w:w="3231"/>
-            <w:shd w:fill="EFF1F9"/>
+            <w:shd w:val="clear" w:color="auto" w:fill="EFF1F9"/>
           </w:tcPr>
           <w:p>
             <w:pPr>
@@ -1511,7 +1717,7 @@
           <w:color w:val="222436"/>
           <w:sz w:val="20"/>
         </w:rPr>
-        <w:t>Боевой API ФСП не предоставлен; демонстрационный adapter и введенный ID не выдаются за внешнюю верификацию. Действующая коммерческая ATS и юридическая проверка компаний не заявлены.</w:t>
+        <w:t>Боевой API ФСП не предоставлен; демонстрационный adapter и введенный ID не выдаются за внешнюю верификацию. Действующая коммерческая ATS и юридическая проверка компаний не заявлены; их концепции – в разделе 14 технической документации.</w:t>
       </w:r>
     </w:p>
     <w:p>
@@ -1606,11 +1812,11 @@
       <w:hyperlink r:id="rId13">
         <w:r>
           <w:rPr>
+            <w:rFonts w:ascii="Arial" w:hAnsi="Arial" w:cs="Arial"/>
             <w:color w:val="402FFF"/>
             <w:u w:val="single"/>
-            <w:rFonts w:ascii="Arial" w:hAnsi="Arial"/>
           </w:rPr>
-          <w:t>codematch@mail.ru</w:t>
+          <w:t xml:space="preserve">codematch@mail.ru</w:t>
         </w:r>
       </w:hyperlink>
       <w:r>
@@ -1620,7 +1826,7 @@
           <w:color w:val="222436"/>
           <w:sz w:val="20"/>
         </w:rPr>
-        <w:t>. Личные пароли, mail tokens и одноразовые MAX-коды не включайте в отчет.</w:t>
+        <w:t>.</w:t>
       </w:r>
     </w:p>
     <w:p>
@@ -1674,7 +1880,7 @@
           <w:color w:val="222436"/>
           <w:sz w:val="20"/>
         </w:rPr>
-        <w:t xml:space="preserve">Свежий повтор на подготовленной копии исходников 11.10: </w:t>
+        <w:t xml:space="preserve">Проверки </w:t>
       </w:r>
       <w:r>
         <w:rPr>
@@ -1683,7 +1889,7 @@
           <w:color w:val="222436"/>
           <w:sz w:val="20"/>
         </w:rPr>
-        <w:t>186 backend PASS /3 PostgreSQL SKIP</w:t>
+        <w:t>11.10</w:t>
       </w:r>
       <w:r>
         <w:rPr>
@@ -1692,7 +1898,43 @@
           <w:color w:val="222436"/>
           <w:sz w:val="20"/>
         </w:rPr>
-        <w:t xml:space="preserve">, </w:t>
+        <w:t xml:space="preserve"> относятся к релизу </w:t>
+      </w:r>
+      <w:r>
+        <w:rPr>
+          <w:rFonts w:ascii="Arial" w:hAnsi="Arial"/>
+          <w:b/>
+          <w:color w:val="222436"/>
+          <w:sz w:val="20"/>
+        </w:rPr>
+        <w:t>0.1.0-20261011T104017Z</w:t>
+      </w:r>
+      <w:r>
+        <w:rPr>
+          <w:rFonts w:ascii="Arial" w:hAnsi="Arial"/>
+          <w:b w:val="0"/>
+          <w:color w:val="222436"/>
+          <w:sz w:val="20"/>
+        </w:rPr>
+        <w:t xml:space="preserve">. Копия исходников: </w:t>
+      </w:r>
+      <w:r>
+        <w:rPr>
+          <w:rFonts w:ascii="Arial" w:hAnsi="Arial"/>
+          <w:b/>
+          <w:color w:val="222436"/>
+          <w:sz w:val="20"/>
+        </w:rPr>
+        <w:t>186 backend PASS / 3 PostgreSQL SKIP</w:t>
+      </w:r>
+      <w:r>
+        <w:rPr>
+          <w:rFonts w:ascii="Arial" w:hAnsi="Arial"/>
+          <w:b w:val="0"/>
+          <w:color w:val="222436"/>
+          <w:sz w:val="20"/>
+        </w:rPr>
+        <w:t xml:space="preserve"> (в локальном прогоне нет отдельной тестовой БД) и </w:t>
       </w:r>
       <w:r>
         <w:rPr>
@@ -1710,7 +1952,25 @@
           <w:color w:val="222436"/>
           <w:sz w:val="20"/>
         </w:rPr>
-        <w:t>. Отдельная production-сборка опубликованного релиза сверена с JS/CSS сервера. Offline: 120 форм, 720 оценок с повтором, 180 основных пар, 78 проверок без ошибок. Это авторская синтетическая groundtruth, не независимая психометрическая оценка людей. На 6 holdout-потребностях P@5=0.3333; nDCG@5=1.0 по 5 запросам с положительной разметкой. Нельзя переводить nDCG в «100% качество найма».</w:t>
+        <w:t xml:space="preserve">; отдельный запуск на выделенной тестовой БД сервера – </w:t>
+      </w:r>
+      <w:r>
+        <w:rPr>
+          <w:rFonts w:ascii="Arial" w:hAnsi="Arial"/>
+          <w:b/>
+          <w:color w:val="222436"/>
+          <w:sz w:val="20"/>
+        </w:rPr>
+        <w:t>3 PASS / 0 SKIP</w:t>
+      </w:r>
+      <w:r>
+        <w:rPr>
+          <w:rFonts w:ascii="Arial" w:hAnsi="Arial"/>
+          <w:b w:val="0"/>
+          <w:color w:val="222436"/>
+          <w:sz w:val="20"/>
+        </w:rPr>
+        <w:t>, фактический dump/restore совпал по 23 таблицам. Опубликованные JS/CSS совпали с локальной production-сборкой. Offline: 120 форм, 720 оценок с повтором, 180 основных пар, 78 проверок без ошибок. Это авторская синтетическая groundtruth, не независимая психометрическая оценка людей. На 6 holdout-потребностях P@5=0.3333; nDCG@5=1.0 по 5 запросам с положительной разметкой. Нельзя переводить nDCG в «100% качество найма».</w:t>
       </w:r>
     </w:p>
     <w:p>
@@ -1721,80 +1981,7 @@
           <w:color w:val="222436"/>
           <w:sz w:val="20"/>
         </w:rPr>
-        <w:t xml:space="preserve">Свежий релиз </w:t>
-      </w:r>
-      <w:r>
-        <w:rPr>
-          <w:rFonts w:ascii="Arial" w:hAnsi="Arial"/>
-          <w:b/>
-          <w:color w:val="222436"/>
-          <w:sz w:val="20"/>
-        </w:rPr>
-        <w:t>0.1.0-20261011T104017Z</w:t>
-      </w:r>
-      <w:r>
-        <w:rPr>
-          <w:rFonts w:ascii="Arial" w:hAnsi="Arial"/>
-          <w:b w:val="0"/>
-          <w:color w:val="222436"/>
-          <w:sz w:val="20"/>
-        </w:rPr>
-        <w:t xml:space="preserve">, </w:t>
-      </w:r>
-      <w:hyperlink r:id="rId14">
-        <w:r>
-          <w:rPr>
-            <w:color w:val="402FFF"/>
-            <w:u w:val="single"/>
-            <w:rFonts w:ascii="Arial" w:hAnsi="Arial"/>
-          </w:rPr>
-          <w:t>репозиторий</w:t>
-        </w:r>
-      </w:hyperlink>
-      <w:r>
-        <w:rPr>
-          <w:rFonts w:ascii="Arial" w:hAnsi="Arial"/>
-          <w:b w:val="0"/>
-          <w:color w:val="222436"/>
-          <w:sz w:val="20"/>
-        </w:rPr>
-        <w:t xml:space="preserve"> подготовлен приватным. В новом GUI-проходе 11.10 подтвержденный кандидат сохранил анкету, прошел Python Junior 100/100 и восстановил draft после reload; это техническая проверка команды. Отдельные PostgreSQL concurrency проверки дали 3 PASS/0 SKIP, фактический dump/restore совпал по 23 таблицам. Свежий статус приведен в </w:t>
-      </w:r>
-      <w:r>
-        <w:rPr>
-          <w:rFonts w:ascii="Arial" w:hAnsi="Arial"/>
-          <w:b/>
-          <w:color w:val="222436"/>
-          <w:sz w:val="20"/>
-        </w:rPr>
-        <w:t>отчете приемки</w:t>
-      </w:r>
-      <w:r>
-        <w:rPr>
-          <w:rFonts w:ascii="Arial" w:hAnsi="Arial"/>
-          <w:b w:val="0"/>
-          <w:color w:val="222436"/>
-          <w:sz w:val="20"/>
-        </w:rPr>
-        <w:t xml:space="preserve"> папки </w:t>
-      </w:r>
-      <w:r>
-        <w:rPr>
-          <w:rFonts w:ascii="Courier New" w:hAnsi="Courier New"/>
-          <w:b w:val="0"/>
-          <w:color w:val="222436"/>
-          <w:sz w:val="16"/>
-        </w:rPr>
-        <w:t>evidence/</w:t>
-      </w:r>
-      <w:r>
-        <w:rPr>
-          <w:rFonts w:ascii="Arial" w:hAnsi="Arial"/>
-          <w:b w:val="0"/>
-          <w:color w:val="222436"/>
-          <w:sz w:val="20"/>
-        </w:rPr>
-        <w:t>. Локальный backend прогон, 12 frontend проверок и offline-валидация повторены на актуальной копии исходников без изменения production данных. Три PostgreSQL проверки пропущены только в этом локальном прогоне; отдельный запуск на QA БД сервера завершился 3 PASS /0 SKIP. Датированное evidence и объем проверки имеют приоритет перед словом «готово». Физические клиенты, получение mail в inbox и непроведенные отдельные шаги указываются явно; снимок экрана и mock не подменяют полный путь.</w:t>
+        <w:t>В GUI-проходе 11.10 подтвержденный кандидат сохранил анкету, прошел Python Junior 100/100 и восстановил draft после reload; это техническая проверка команды. API-проверка охватила четыре обычных подтвержденных аккаунта (три кандидата и работодателя), собственные PDF, RBAC и logout: 32 проверки прошли. Реальная LLM разобрала потребность за 29.154 с и пояснила подбор за 5.884 с, индекс 97 не изменился. SMTP SSL 465 успешно авторизован, новых писем не отправляли; это не новое доказательство получения в inbox.</w:t>
       </w:r>
     </w:p>
     <w:p>
@@ -1805,16 +1992,16 @@
           <w:color w:val="222436"/>
           <w:sz w:val="20"/>
         </w:rPr>
-        <w:t xml:space="preserve">Новая API-проверка 11.10 охватила четыре обычных подтвержденных аккаунта (три кандидата и работодателя), собственные PDF, RBAC и logout: 32 проверки прошли. Реальная LLM разобрала потребность за 29.154 с и пояснила подбор за 5.884 с, индекс 97 не изменился. SMTP SSL465 успешно авторизован, новых писем не отправляли; это не новое доказательство получения в inbox. Подробности: </w:t>
+        <w:t xml:space="preserve">Независимая повторная проверка 11.10 (r2): </w:t>
       </w:r>
       <w:r>
         <w:rPr>
           <w:rFonts w:ascii="Courier New" w:hAnsi="Courier New"/>
           <w:b w:val="0"/>
           <w:color w:val="222436"/>
-          <w:sz w:val="16"/>
+          <w:sz w:val="17"/>
         </w:rPr>
-        <w:t>КОД.МЭТЧ_Техническая_документация.pdf</w:t>
+        <w:t>evidence/independent-20261011/status.json</w:t>
       </w:r>
       <w:r>
         <w:rPr>
@@ -1823,14 +2010,33 @@
           <w:color w:val="222436"/>
           <w:sz w:val="20"/>
         </w:rPr>
-        <w:t xml:space="preserve">, исходники в </w:t>
+        <w:t xml:space="preserve"> – тесты 186 PASS / 3 SKIP / 0 FAIL, 12/12, 78/0; JS/CSS сервиса совпадают с исходником; интерфейс двух ролей пройден на локальной копии; боевые аккаунты, MAX и внешний ящик в r2 не проверялись. Исходники: </w:t>
+      </w:r>
+      <w:hyperlink r:id="rId14">
+        <w:r>
+          <w:rPr>
+            <w:rFonts w:ascii="Arial" w:hAnsi="Arial" w:cs="Arial"/>
+            <w:color w:val="402FFF"/>
+            <w:u w:val="single"/>
+          </w:rPr>
+          <w:t xml:space="preserve">репозиторий</w:t>
+        </w:r>
+      </w:hyperlink>
+      <w:r>
+        <w:rPr>
+          <w:rFonts w:ascii="Arial" w:hAnsi="Arial"/>
+          <w:b w:val="0"/>
+          <w:color w:val="222436"/>
+          <w:sz w:val="20"/>
+        </w:rPr>
+        <w:t xml:space="preserve">; если он недоступен, используйте копию в </w:t>
       </w:r>
       <w:r>
         <w:rPr>
           <w:rFonts w:ascii="Courier New" w:hAnsi="Courier New"/>
           <w:b w:val="0"/>
           <w:color w:val="222436"/>
-          <w:sz w:val="16"/>
+          <w:sz w:val="17"/>
         </w:rPr>
         <w:t>source/</w:t>
       </w:r>
@@ -1841,25 +2047,7 @@
           <w:color w:val="222436"/>
           <w:sz w:val="20"/>
         </w:rPr>
-        <w:t xml:space="preserve">, презентация в </w:t>
-      </w:r>
-      <w:r>
-        <w:rPr>
-          <w:rFonts w:ascii="Courier New" w:hAnsi="Courier New"/>
-          <w:b w:val="0"/>
-          <w:color w:val="222436"/>
-          <w:sz w:val="16"/>
-        </w:rPr>
-        <w:t>presentation/</w:t>
-      </w:r>
-      <w:r>
-        <w:rPr>
-          <w:rFonts w:ascii="Arial" w:hAnsi="Arial"/>
-          <w:b w:val="0"/>
-          <w:color w:val="222436"/>
-          <w:sz w:val="20"/>
-        </w:rPr>
-        <w:t xml:space="preserve">. Если найден сбой, сообщите роль, действие, время, ожидаемое и фактическое поведение в поддержку. Не передавайте секреты. Оператор и капитан: </w:t>
+        <w:t xml:space="preserve">. Оператор и капитан: </w:t>
       </w:r>
       <w:r>
         <w:rPr>
@@ -1933,11 +2121,11 @@
   <w:p>
     <w:pPr>
       <w:pStyle w:val="Footer"/>
-      <w:spacing w:before="40"/>
       <w:jc w:val="right"/>
     </w:pPr>
     <w:r>
       <w:rPr>
+        <w:rFonts w:ascii="Arial" w:hAnsi="Arial"/>
         <w:color w:val="5A6174"/>
         <w:sz w:val="16"/>
       </w:rPr>
@@ -2771,13 +2959,8 @@
     <w:unhideWhenUsed/>
     <w:rsid w:val="00AA1D8D"/>
     <w:pPr>
-      <w:spacing w:after="120" w:line="269" w:lineRule="auto"/>
-    </w:pPr>
-    <w:rPr>
-      <w:rFonts w:ascii="Arial" w:hAnsi="Arial"/>
-      <w:color w:val="222436"/>
-      <w:sz w:val="20"/>
-    </w:rPr>
+      <w:spacing w:after="120"/>
+    </w:pPr>
   </w:style>
   <w:style w:type="character" w:customStyle="1" w:styleId="BodyTextChar">
     <w:name w:val="Body Text Char"/>

</xml_diff>